<commit_message>
Update team roles in Project Charter
</commit_message>
<xml_diff>
--- a/docs/Documentation/Project Charter.docx
+++ b/docs/Documentation/Project Charter.docx
@@ -94,14 +94,7 @@
           <w:rFonts w:asciiTheme="majorBidi" w:hAnsiTheme="majorBidi" w:cstheme="majorBidi"/>
           <w:lang w:val="en-US"/>
         </w:rPr>
-        <w:t>Nada Zaki:</w:t>
-      </w:r>
-      <w:r>
-        <w:rPr>
-          <w:rFonts w:asciiTheme="majorBidi" w:hAnsiTheme="majorBidi" w:cstheme="majorBidi"/>
-          <w:lang w:val="en-US"/>
-        </w:rPr>
-        <w:t xml:space="preserve"> Software developer</w:t>
+        <w:t>Nada Zaki: Software Developer</w:t>
       </w:r>
     </w:p>
     <w:p>
@@ -118,21 +111,7 @@
           <w:lang w:val="en-US"/>
         </w:rPr>
         <w:tab/>
-        <w:t>Mona Elsayed:</w:t>
-      </w:r>
-      <w:r>
-        <w:rPr>
-          <w:rFonts w:asciiTheme="majorBidi" w:hAnsiTheme="majorBidi" w:cstheme="majorBidi"/>
-          <w:lang w:val="en-US"/>
-        </w:rPr>
-        <w:t xml:space="preserve"> </w:t>
-      </w:r>
-      <w:r>
-        <w:rPr>
-          <w:rFonts w:asciiTheme="majorBidi" w:hAnsiTheme="majorBidi" w:cstheme="majorBidi"/>
-          <w:lang w:val="en-US"/>
-        </w:rPr>
-        <w:t>Software developer</w:t>
+        <w:t>Mona Elsayed: Software Developer</w:t>
       </w:r>
     </w:p>
     <w:p>
@@ -149,44 +128,7 @@
           <w:lang w:val="en-US"/>
         </w:rPr>
         <w:tab/>
-        <w:t xml:space="preserve">Hana </w:t>
-      </w:r>
-      <w:proofErr w:type="spellStart"/>
-      <w:r>
-        <w:rPr>
-          <w:rFonts w:asciiTheme="majorBidi" w:hAnsiTheme="majorBidi" w:cstheme="majorBidi"/>
-          <w:lang w:val="en-US"/>
-        </w:rPr>
-        <w:t>Elgabry</w:t>
-      </w:r>
-      <w:proofErr w:type="spellEnd"/>
-      <w:r>
-        <w:rPr>
-          <w:rFonts w:asciiTheme="majorBidi" w:hAnsiTheme="majorBidi" w:cstheme="majorBidi"/>
-          <w:lang w:val="en-US"/>
-        </w:rPr>
-        <w:t>:</w:t>
-      </w:r>
-      <w:r>
-        <w:rPr>
-          <w:rFonts w:asciiTheme="majorBidi" w:hAnsiTheme="majorBidi" w:cstheme="majorBidi"/>
-          <w:lang w:val="en-US"/>
-        </w:rPr>
-        <w:t xml:space="preserve"> </w:t>
-      </w:r>
-      <w:r>
-        <w:rPr>
-          <w:rFonts w:asciiTheme="majorBidi" w:hAnsiTheme="majorBidi" w:cstheme="majorBidi"/>
-          <w:lang w:val="en-US"/>
-        </w:rPr>
-        <w:t>AI</w:t>
-      </w:r>
-      <w:r>
-        <w:rPr>
-          <w:rFonts w:asciiTheme="majorBidi" w:hAnsiTheme="majorBidi" w:cstheme="majorBidi"/>
-          <w:lang w:val="en-US"/>
-        </w:rPr>
-        <w:t xml:space="preserve"> developer</w:t>
+        <w:t>Hana Elgabry: CV Engineer</w:t>
       </w:r>
     </w:p>
     <w:p>
@@ -219,21 +161,7 @@
           <w:rFonts w:asciiTheme="majorBidi" w:hAnsiTheme="majorBidi" w:cstheme="majorBidi"/>
           <w:lang w:val="en-US"/>
         </w:rPr>
-        <w:t>:</w:t>
-      </w:r>
-      <w:r>
-        <w:rPr>
-          <w:rFonts w:asciiTheme="majorBidi" w:hAnsiTheme="majorBidi" w:cstheme="majorBidi"/>
-          <w:lang w:val="en-US"/>
-        </w:rPr>
-        <w:t xml:space="preserve"> AI</w:t>
-      </w:r>
-      <w:r>
-        <w:rPr>
-          <w:rFonts w:asciiTheme="majorBidi" w:hAnsiTheme="majorBidi" w:cstheme="majorBidi"/>
-          <w:lang w:val="en-US"/>
-        </w:rPr>
-        <w:t xml:space="preserve"> developer</w:t>
+        <w:t>: Agentic AI Developer</w:t>
       </w:r>
     </w:p>
     <w:p>
@@ -250,21 +178,7 @@
           <w:lang w:val="en-US"/>
         </w:rPr>
         <w:tab/>
-        <w:t>Zeina Ahmed:</w:t>
-      </w:r>
-      <w:r>
-        <w:rPr>
-          <w:rFonts w:asciiTheme="majorBidi" w:hAnsiTheme="majorBidi" w:cstheme="majorBidi"/>
-          <w:lang w:val="en-US"/>
-        </w:rPr>
-        <w:t xml:space="preserve"> AI</w:t>
-      </w:r>
-      <w:r>
-        <w:rPr>
-          <w:rFonts w:asciiTheme="majorBidi" w:hAnsiTheme="majorBidi" w:cstheme="majorBidi"/>
-          <w:lang w:val="en-US"/>
-        </w:rPr>
-        <w:t xml:space="preserve"> developer</w:t>
+        <w:t>Zeina Ahmed: Agentic AI Developer</w:t>
       </w:r>
     </w:p>
     <w:p>
@@ -296,21 +210,7 @@
           <w:rFonts w:asciiTheme="majorBidi" w:hAnsiTheme="majorBidi" w:cstheme="majorBidi"/>
           <w:lang w:val="en-US"/>
         </w:rPr>
-        <w:t xml:space="preserve"> Mohamed:</w:t>
-      </w:r>
-      <w:r>
-        <w:rPr>
-          <w:rFonts w:asciiTheme="majorBidi" w:hAnsiTheme="majorBidi" w:cstheme="majorBidi"/>
-          <w:lang w:val="en-US"/>
-        </w:rPr>
-        <w:t xml:space="preserve"> AI</w:t>
-      </w:r>
-      <w:r>
-        <w:rPr>
-          <w:rFonts w:asciiTheme="majorBidi" w:hAnsiTheme="majorBidi" w:cstheme="majorBidi"/>
-          <w:lang w:val="en-US"/>
-        </w:rPr>
-        <w:t xml:space="preserve"> developer</w:t>
+        <w:t xml:space="preserve"> Mohamed: AI R&amp;D</w:t>
       </w:r>
     </w:p>
     <w:p>
@@ -644,13 +544,7 @@
         <w:t> </w:t>
       </w:r>
       <w:r>
-        <w:t>Provide an AI-driven tutor that delivers content (including video explanations), responds to interruptions, analyzes these interruptions,</w:t>
-      </w:r>
-      <w:r>
-        <w:t xml:space="preserve"> </w:t>
-      </w:r>
-      <w:r>
-        <w:t>conducts adaptive assessments and adjusts evaluation accordingly. Assessment considers not only correctness of answers but also detected emotions and engagement levels.</w:t>
+        <w:t>Provide an AI-driven tutor that delivers content (including video explanations), responds to interruptions, analyzes these interruptions, conducts adaptive assessments and adjusts evaluation accordingly. Assessment considers not only correctness of answers but also detected emotions and engagement levels.</w:t>
       </w:r>
     </w:p>
     <w:p>

</xml_diff>